<commit_message>
ultima modificación de los reports
</commit_message>
<xml_diff>
--- a/reports/C3/Student #3/03 - Requirements - Student #3.docx
+++ b/reports/C3/Student #3/03 - Requirements - Student #3.docx
@@ -1719,7 +1719,7 @@
       <w:r>
         <w:rPr>
           <w:rStyle w:val="Ninguno"/>
-          <w:lang w:val="es-ES"/>
+          <w:lang w:val="en-GB"/>
         </w:rPr>
         <w:t xml:space="preserve">   </w:t>
       </w:r>
@@ -2189,6 +2189,13 @@
           <w:lang w:val="es-ES"/>
         </w:rPr>
         <w:t>Corrección: se ha cambiado la lógica de las querys para que solo se muestren las legs disponibles.</w:t>
+      </w:r>
+      <w:r>
+        <w:rPr>
+          <w:color w:val="535353" w:themeColor="background2"/>
+          <w:lang w:val="es-ES"/>
+        </w:rPr>
+        <w:t xml:space="preserve"> Además se ha creado un “constraint” personalizado para la entidad flight assignment, de modo que no se puedan crear assignments cuyo member asignado no sea de la misma aerolínea que el tramo de vuelo.</w:t>
       </w:r>
     </w:p>
     <w:p>
@@ -2388,7 +2395,15 @@
           <w:color w:val="A7A7A7"/>
           <w:lang w:val="es-ES"/>
         </w:rPr>
-        <w:t>ógica de forma que se puedan ver los activity logs, pero solo se puedan crear en caso de que el tramo asignado al assignment esté completo y el assignment en cuestión esté publicado.</w:t>
+        <w:t xml:space="preserve">ógica de forma que se puedan ver los activity logs, pero solo se puedan crear en caso de que el tramo asignado al assignment esté completo y el assignment en cuestión esté </w:t>
+      </w:r>
+      <w:r>
+        <w:rPr>
+          <w:color w:val="A7A7A7"/>
+          <w:lang w:val="es-ES"/>
+        </w:rPr>
+        <w:lastRenderedPageBreak/>
+        <w:t>publicado.</w:t>
       </w:r>
       <w:r>
         <w:rPr>
@@ -2419,7 +2434,6 @@
           <w:rStyle w:val="Ninguno"/>
           <w:lang w:val="es-ES"/>
         </w:rPr>
-        <w:lastRenderedPageBreak/>
         <w:t xml:space="preserve">Aparece un error 500 al </w:t>
       </w:r>
       <w:r>
@@ -2659,6 +2673,7 @@
         <w:rPr>
           <w:rStyle w:val="Ninguno"/>
         </w:rPr>
+        <w:lastRenderedPageBreak/>
         <w:t>Managerial requirements</w:t>
       </w:r>
     </w:p>
@@ -2724,7 +2739,6 @@
           <w:color w:val="535353" w:themeColor="background2"/>
           <w:lang w:val="es-ES"/>
         </w:rPr>
-        <w:lastRenderedPageBreak/>
         <w:t>Corrección: he creado las tareas correspondientes a la 3era convocatoria</w:t>
       </w:r>
       <w:r>
@@ -5607,7 +5621,7 @@
   <w:num w:numId="3" w16cid:durableId="1575160138">
     <w:abstractNumId w:val="0"/>
     <w:lvlOverride w:ilvl="0">
-      <w:lvl w:ilvl="0" w:tplc="59988C34">
+      <w:lvl w:ilvl="0" w:tplc="948670F4">
         <w:start w:val="1"/>
         <w:numFmt w:val="decimal"/>
         <w:lvlText w:val="%1)"/>
@@ -5634,7 +5648,7 @@
       </w:lvl>
     </w:lvlOverride>
     <w:lvlOverride w:ilvl="1">
-      <w:lvl w:ilvl="1" w:tplc="374EF8FA">
+      <w:lvl w:ilvl="1" w:tplc="DFE4CE94">
         <w:start w:val="1"/>
         <w:numFmt w:val="lowerLetter"/>
         <w:lvlText w:val="%2."/>
@@ -5661,7 +5675,7 @@
       </w:lvl>
     </w:lvlOverride>
     <w:lvlOverride w:ilvl="2">
-      <w:lvl w:ilvl="2" w:tplc="2AC29F86">
+      <w:lvl w:ilvl="2" w:tplc="B9CE90BE">
         <w:start w:val="1"/>
         <w:numFmt w:val="lowerRoman"/>
         <w:lvlText w:val="%3."/>
@@ -5688,7 +5702,7 @@
       </w:lvl>
     </w:lvlOverride>
     <w:lvlOverride w:ilvl="3">
-      <w:lvl w:ilvl="3" w:tplc="70F85BFE">
+      <w:lvl w:ilvl="3" w:tplc="6848E8FE">
         <w:start w:val="1"/>
         <w:numFmt w:val="decimal"/>
         <w:lvlText w:val="%4."/>
@@ -5715,7 +5729,7 @@
       </w:lvl>
     </w:lvlOverride>
     <w:lvlOverride w:ilvl="4">
-      <w:lvl w:ilvl="4" w:tplc="B8CE6182">
+      <w:lvl w:ilvl="4" w:tplc="D982032A">
         <w:start w:val="1"/>
         <w:numFmt w:val="lowerLetter"/>
         <w:lvlText w:val="%5."/>
@@ -5742,7 +5756,7 @@
       </w:lvl>
     </w:lvlOverride>
     <w:lvlOverride w:ilvl="5">
-      <w:lvl w:ilvl="5" w:tplc="1E2257D8">
+      <w:lvl w:ilvl="5" w:tplc="CAD4AD8E">
         <w:start w:val="1"/>
         <w:numFmt w:val="lowerRoman"/>
         <w:lvlText w:val="%6."/>
@@ -5769,7 +5783,7 @@
       </w:lvl>
     </w:lvlOverride>
     <w:lvlOverride w:ilvl="6">
-      <w:lvl w:ilvl="6" w:tplc="5BC892DE">
+      <w:lvl w:ilvl="6" w:tplc="D33C4500">
         <w:start w:val="1"/>
         <w:numFmt w:val="decimal"/>
         <w:lvlText w:val="%7."/>
@@ -5796,7 +5810,7 @@
       </w:lvl>
     </w:lvlOverride>
     <w:lvlOverride w:ilvl="7">
-      <w:lvl w:ilvl="7" w:tplc="DE2CEF74">
+      <w:lvl w:ilvl="7" w:tplc="83387F8A">
         <w:start w:val="1"/>
         <w:numFmt w:val="lowerLetter"/>
         <w:lvlText w:val="%8."/>
@@ -5823,7 +5837,7 @@
       </w:lvl>
     </w:lvlOverride>
     <w:lvlOverride w:ilvl="8">
-      <w:lvl w:ilvl="8" w:tplc="EF34303E">
+      <w:lvl w:ilvl="8" w:tplc="763EC39C">
         <w:start w:val="1"/>
         <w:numFmt w:val="lowerRoman"/>
         <w:lvlText w:val="%9."/>
@@ -5872,7 +5886,7 @@
     <w:abstractNumId w:val="0"/>
     <w:lvlOverride w:ilvl="0">
       <w:startOverride w:val="10"/>
-      <w:lvl w:ilvl="0" w:tplc="59988C34">
+      <w:lvl w:ilvl="0" w:tplc="948670F4">
         <w:start w:val="10"/>
         <w:numFmt w:val="decimal"/>
         <w:lvlText w:val="%1)"/>
@@ -5900,7 +5914,7 @@
     </w:lvlOverride>
     <w:lvlOverride w:ilvl="1">
       <w:startOverride w:val="1"/>
-      <w:lvl w:ilvl="1" w:tplc="374EF8FA">
+      <w:lvl w:ilvl="1" w:tplc="DFE4CE94">
         <w:start w:val="1"/>
         <w:numFmt w:val="lowerLetter"/>
         <w:lvlText w:val="%2."/>
@@ -5928,7 +5942,7 @@
     </w:lvlOverride>
     <w:lvlOverride w:ilvl="2">
       <w:startOverride w:val="1"/>
-      <w:lvl w:ilvl="2" w:tplc="2AC29F86">
+      <w:lvl w:ilvl="2" w:tplc="B9CE90BE">
         <w:start w:val="1"/>
         <w:numFmt w:val="lowerRoman"/>
         <w:lvlText w:val="%3."/>
@@ -5956,7 +5970,7 @@
     </w:lvlOverride>
     <w:lvlOverride w:ilvl="3">
       <w:startOverride w:val="1"/>
-      <w:lvl w:ilvl="3" w:tplc="70F85BFE">
+      <w:lvl w:ilvl="3" w:tplc="6848E8FE">
         <w:start w:val="1"/>
         <w:numFmt w:val="decimal"/>
         <w:lvlText w:val="%4."/>
@@ -5984,7 +5998,7 @@
     </w:lvlOverride>
     <w:lvlOverride w:ilvl="4">
       <w:startOverride w:val="1"/>
-      <w:lvl w:ilvl="4" w:tplc="B8CE6182">
+      <w:lvl w:ilvl="4" w:tplc="D982032A">
         <w:start w:val="1"/>
         <w:numFmt w:val="lowerLetter"/>
         <w:lvlText w:val="%5."/>
@@ -6012,7 +6026,7 @@
     </w:lvlOverride>
     <w:lvlOverride w:ilvl="5">
       <w:startOverride w:val="1"/>
-      <w:lvl w:ilvl="5" w:tplc="1E2257D8">
+      <w:lvl w:ilvl="5" w:tplc="CAD4AD8E">
         <w:start w:val="1"/>
         <w:numFmt w:val="lowerRoman"/>
         <w:lvlText w:val="%6."/>
@@ -6040,7 +6054,7 @@
     </w:lvlOverride>
     <w:lvlOverride w:ilvl="6">
       <w:startOverride w:val="1"/>
-      <w:lvl w:ilvl="6" w:tplc="5BC892DE">
+      <w:lvl w:ilvl="6" w:tplc="D33C4500">
         <w:start w:val="1"/>
         <w:numFmt w:val="decimal"/>
         <w:lvlText w:val="%7."/>
@@ -6068,7 +6082,7 @@
     </w:lvlOverride>
     <w:lvlOverride w:ilvl="7">
       <w:startOverride w:val="1"/>
-      <w:lvl w:ilvl="7" w:tplc="DE2CEF74">
+      <w:lvl w:ilvl="7" w:tplc="83387F8A">
         <w:start w:val="1"/>
         <w:numFmt w:val="lowerLetter"/>
         <w:lvlText w:val="%8."/>
@@ -6096,7 +6110,7 @@
     </w:lvlOverride>
     <w:lvlOverride w:ilvl="8">
       <w:startOverride w:val="1"/>
-      <w:lvl w:ilvl="8" w:tplc="EF34303E">
+      <w:lvl w:ilvl="8" w:tplc="763EC39C">
         <w:start w:val="1"/>
         <w:numFmt w:val="lowerRoman"/>
         <w:lvlText w:val="%9."/>
@@ -6599,6 +6613,7 @@
   <w:style w:type="character" w:default="1" w:styleId="Fuentedeprrafopredeter">
     <w:name w:val="Default Paragraph Font"/>
     <w:uiPriority w:val="1"/>
+    <w:semiHidden/>
     <w:unhideWhenUsed/>
   </w:style>
   <w:style w:type="table" w:default="1" w:styleId="Tablanormal">

</xml_diff>

<commit_message>
modificacion hoja de evaluación
</commit_message>
<xml_diff>
--- a/reports/C3/Student #3/03 - Requirements - Student #3.docx
+++ b/reports/C3/Student #3/03 - Requirements - Student #3.docx
@@ -2188,7 +2188,21 @@
           <w:color w:val="535353" w:themeColor="background2"/>
           <w:lang w:val="es-ES"/>
         </w:rPr>
-        <w:t>Corrección: se ha cambiado la lógica de las querys para que solo se muestren las legs disponibles.</w:t>
+        <w:t>Corrección: se ha cambiado la lógica de las querys para que solo se muestren las legs disponibles</w:t>
+      </w:r>
+      <w:r>
+        <w:rPr>
+          <w:color w:val="535353" w:themeColor="background2"/>
+          <w:lang w:val="es-ES"/>
+        </w:rPr>
+        <w:t>(que esten publicadas y que el airline asociado sea el mismo que el del member logeado)</w:t>
+      </w:r>
+      <w:r>
+        <w:rPr>
+          <w:color w:val="535353" w:themeColor="background2"/>
+          <w:lang w:val="es-ES"/>
+        </w:rPr>
+        <w:t>.</w:t>
       </w:r>
       <w:r>
         <w:rPr>
@@ -5621,7 +5635,7 @@
   <w:num w:numId="3" w16cid:durableId="1575160138">
     <w:abstractNumId w:val="0"/>
     <w:lvlOverride w:ilvl="0">
-      <w:lvl w:ilvl="0" w:tplc="948670F4">
+      <w:lvl w:ilvl="0" w:tplc="ACF6E922">
         <w:start w:val="1"/>
         <w:numFmt w:val="decimal"/>
         <w:lvlText w:val="%1)"/>
@@ -5648,7 +5662,7 @@
       </w:lvl>
     </w:lvlOverride>
     <w:lvlOverride w:ilvl="1">
-      <w:lvl w:ilvl="1" w:tplc="DFE4CE94">
+      <w:lvl w:ilvl="1" w:tplc="69844FD6">
         <w:start w:val="1"/>
         <w:numFmt w:val="lowerLetter"/>
         <w:lvlText w:val="%2."/>
@@ -5675,7 +5689,7 @@
       </w:lvl>
     </w:lvlOverride>
     <w:lvlOverride w:ilvl="2">
-      <w:lvl w:ilvl="2" w:tplc="B9CE90BE">
+      <w:lvl w:ilvl="2" w:tplc="16CE65B0">
         <w:start w:val="1"/>
         <w:numFmt w:val="lowerRoman"/>
         <w:lvlText w:val="%3."/>
@@ -5702,7 +5716,7 @@
       </w:lvl>
     </w:lvlOverride>
     <w:lvlOverride w:ilvl="3">
-      <w:lvl w:ilvl="3" w:tplc="6848E8FE">
+      <w:lvl w:ilvl="3" w:tplc="70643DBC">
         <w:start w:val="1"/>
         <w:numFmt w:val="decimal"/>
         <w:lvlText w:val="%4."/>
@@ -5729,7 +5743,7 @@
       </w:lvl>
     </w:lvlOverride>
     <w:lvlOverride w:ilvl="4">
-      <w:lvl w:ilvl="4" w:tplc="D982032A">
+      <w:lvl w:ilvl="4" w:tplc="C436FE90">
         <w:start w:val="1"/>
         <w:numFmt w:val="lowerLetter"/>
         <w:lvlText w:val="%5."/>
@@ -5756,7 +5770,7 @@
       </w:lvl>
     </w:lvlOverride>
     <w:lvlOverride w:ilvl="5">
-      <w:lvl w:ilvl="5" w:tplc="CAD4AD8E">
+      <w:lvl w:ilvl="5" w:tplc="A92EF480">
         <w:start w:val="1"/>
         <w:numFmt w:val="lowerRoman"/>
         <w:lvlText w:val="%6."/>
@@ -5783,7 +5797,7 @@
       </w:lvl>
     </w:lvlOverride>
     <w:lvlOverride w:ilvl="6">
-      <w:lvl w:ilvl="6" w:tplc="D33C4500">
+      <w:lvl w:ilvl="6" w:tplc="68888500">
         <w:start w:val="1"/>
         <w:numFmt w:val="decimal"/>
         <w:lvlText w:val="%7."/>
@@ -5810,7 +5824,7 @@
       </w:lvl>
     </w:lvlOverride>
     <w:lvlOverride w:ilvl="7">
-      <w:lvl w:ilvl="7" w:tplc="83387F8A">
+      <w:lvl w:ilvl="7" w:tplc="F26227C4">
         <w:start w:val="1"/>
         <w:numFmt w:val="lowerLetter"/>
         <w:lvlText w:val="%8."/>
@@ -5837,7 +5851,7 @@
       </w:lvl>
     </w:lvlOverride>
     <w:lvlOverride w:ilvl="8">
-      <w:lvl w:ilvl="8" w:tplc="763EC39C">
+      <w:lvl w:ilvl="8" w:tplc="04849176">
         <w:start w:val="1"/>
         <w:numFmt w:val="lowerRoman"/>
         <w:lvlText w:val="%9."/>
@@ -5886,7 +5900,7 @@
     <w:abstractNumId w:val="0"/>
     <w:lvlOverride w:ilvl="0">
       <w:startOverride w:val="10"/>
-      <w:lvl w:ilvl="0" w:tplc="948670F4">
+      <w:lvl w:ilvl="0" w:tplc="ACF6E922">
         <w:start w:val="10"/>
         <w:numFmt w:val="decimal"/>
         <w:lvlText w:val="%1)"/>
@@ -5914,7 +5928,7 @@
     </w:lvlOverride>
     <w:lvlOverride w:ilvl="1">
       <w:startOverride w:val="1"/>
-      <w:lvl w:ilvl="1" w:tplc="DFE4CE94">
+      <w:lvl w:ilvl="1" w:tplc="69844FD6">
         <w:start w:val="1"/>
         <w:numFmt w:val="lowerLetter"/>
         <w:lvlText w:val="%2."/>
@@ -5942,7 +5956,7 @@
     </w:lvlOverride>
     <w:lvlOverride w:ilvl="2">
       <w:startOverride w:val="1"/>
-      <w:lvl w:ilvl="2" w:tplc="B9CE90BE">
+      <w:lvl w:ilvl="2" w:tplc="16CE65B0">
         <w:start w:val="1"/>
         <w:numFmt w:val="lowerRoman"/>
         <w:lvlText w:val="%3."/>
@@ -5970,7 +5984,7 @@
     </w:lvlOverride>
     <w:lvlOverride w:ilvl="3">
       <w:startOverride w:val="1"/>
-      <w:lvl w:ilvl="3" w:tplc="6848E8FE">
+      <w:lvl w:ilvl="3" w:tplc="70643DBC">
         <w:start w:val="1"/>
         <w:numFmt w:val="decimal"/>
         <w:lvlText w:val="%4."/>
@@ -5998,7 +6012,7 @@
     </w:lvlOverride>
     <w:lvlOverride w:ilvl="4">
       <w:startOverride w:val="1"/>
-      <w:lvl w:ilvl="4" w:tplc="D982032A">
+      <w:lvl w:ilvl="4" w:tplc="C436FE90">
         <w:start w:val="1"/>
         <w:numFmt w:val="lowerLetter"/>
         <w:lvlText w:val="%5."/>
@@ -6026,7 +6040,7 @@
     </w:lvlOverride>
     <w:lvlOverride w:ilvl="5">
       <w:startOverride w:val="1"/>
-      <w:lvl w:ilvl="5" w:tplc="CAD4AD8E">
+      <w:lvl w:ilvl="5" w:tplc="A92EF480">
         <w:start w:val="1"/>
         <w:numFmt w:val="lowerRoman"/>
         <w:lvlText w:val="%6."/>
@@ -6054,7 +6068,7 @@
     </w:lvlOverride>
     <w:lvlOverride w:ilvl="6">
       <w:startOverride w:val="1"/>
-      <w:lvl w:ilvl="6" w:tplc="D33C4500">
+      <w:lvl w:ilvl="6" w:tplc="68888500">
         <w:start w:val="1"/>
         <w:numFmt w:val="decimal"/>
         <w:lvlText w:val="%7."/>
@@ -6082,7 +6096,7 @@
     </w:lvlOverride>
     <w:lvlOverride w:ilvl="7">
       <w:startOverride w:val="1"/>
-      <w:lvl w:ilvl="7" w:tplc="83387F8A">
+      <w:lvl w:ilvl="7" w:tplc="F26227C4">
         <w:start w:val="1"/>
         <w:numFmt w:val="lowerLetter"/>
         <w:lvlText w:val="%8."/>
@@ -6110,7 +6124,7 @@
     </w:lvlOverride>
     <w:lvlOverride w:ilvl="8">
       <w:startOverride w:val="1"/>
-      <w:lvl w:ilvl="8" w:tplc="763EC39C">
+      <w:lvl w:ilvl="8" w:tplc="04849176">
         <w:start w:val="1"/>
         <w:numFmt w:val="lowerRoman"/>
         <w:lvlText w:val="%9."/>

</xml_diff>